<commit_message>
Improve prompt for more distinctive resume tailoring
</commit_message>
<xml_diff>
--- a/outputs/resume_frontend_engineer_nexus_systems_2.docx
+++ b/outputs/resume_frontend_engineer_nexus_systems_2.docx
@@ -62,7 +62,7 @@
           <w:sz w:val="22"/>
           <w:szCs w:val="22"/>
         </w:rPr>
-        <w:t xml:space="preserve">Frontend Engineer with a B.S. in Computer Science, experienced in building dynamic web applications. Proven ability to translate designs into polished, accessible user interfaces using modern JavaScript frameworks like React, and adept at collaborating with UX designers and backend engineers to deliver impactful product features.</w:t>
+        <w:t xml:space="preserve">Highly motivated Computer Science graduate with hands-on experience as a Frontend Engineer, passionate about building the next generation of web applications at Nexus Systems. Proven ability to translate designs into polished, accessible user interfaces and collaborate effectively with UX designers and backend engineers to deliver exceptional user experiences.</w:t>
       </w:r>
     </w:p>
     <w:p>
@@ -96,31 +96,43 @@
           <w:sz w:val="22"/>
           <w:szCs w:val="22"/>
         </w:rPr>
-        <w:t xml:space="preserve">FRONTEND: React, JavaScript, TypeScript, HTML, CSS, Figma</w:t>
-      </w:r>
-    </w:p>
-    <w:p>
-      <w:pPr>
-        <w:spacing w:after="60"/>
-      </w:pPr>
-      <w:r>
-        <w:rPr>
-          <w:sz w:val="22"/>
-          <w:szCs w:val="22"/>
-        </w:rPr>
-        <w:t xml:space="preserve">BACKEND/FULL-STACK: Node.js, Express, Python, PostgreSQL, REST APIs</w:t>
-      </w:r>
-    </w:p>
-    <w:p>
-      <w:pPr>
-        <w:spacing w:after="60"/>
-      </w:pPr>
-      <w:r>
-        <w:rPr>
-          <w:sz w:val="22"/>
-          <w:szCs w:val="22"/>
-        </w:rPr>
-        <w:t xml:space="preserve">TOOLS &amp; DEVOPS: Git, Docker, GitHub Actions, AWS, Jira, VS Code, Linux</w:t>
+        <w:t xml:space="preserve">Frontend Technologies: React, JavaScript, TypeScript, HTML5, CSS3, WebSockets, Figma</w:t>
+      </w:r>
+    </w:p>
+    <w:p>
+      <w:pPr>
+        <w:spacing w:after="60"/>
+      </w:pPr>
+      <w:r>
+        <w:rPr>
+          <w:sz w:val="22"/>
+          <w:szCs w:val="22"/>
+        </w:rPr>
+        <w:t xml:space="preserve">Backend Technologies: Node.js, Express, Python, FastAPI</w:t>
+      </w:r>
+    </w:p>
+    <w:p>
+      <w:pPr>
+        <w:spacing w:after="60"/>
+      </w:pPr>
+      <w:r>
+        <w:rPr>
+          <w:sz w:val="22"/>
+          <w:szCs w:val="22"/>
+        </w:rPr>
+        <w:t xml:space="preserve">Tools &amp; Platforms: Git, Docker, AWS (EC2, S3, Lambda), GitHub Actions, Jira, PostgreSQL, Linux</w:t>
+      </w:r>
+    </w:p>
+    <w:p>
+      <w:pPr>
+        <w:spacing w:after="60"/>
+      </w:pPr>
+      <w:r>
+        <w:rPr>
+          <w:sz w:val="22"/>
+          <w:szCs w:val="22"/>
+        </w:rPr>
+        <w:t xml:space="preserve">Familiar with: Terraform, SQL, Java</w:t>
       </w:r>
     </w:p>
     <w:p>
@@ -137,89 +149,137 @@
         <w:spacing w:before="240" w:after="80"/>
       </w:pPr>
       <w:r>
-        <w:t xml:space="preserve">EXPERIENCE</w:t>
-      </w:r>
-    </w:p>
-    <w:p>
-      <w:pPr>
-        <w:spacing w:after="80"/>
-      </w:pPr>
-    </w:p>
-    <w:p>
-      <w:pPr>
-        <w:spacing w:after="60"/>
-      </w:pPr>
-      <w:r>
-        <w:rPr>
-          <w:sz w:val="22"/>
-          <w:szCs w:val="22"/>
-        </w:rPr>
-        <w:t xml:space="preserve">Software Engineering Intern  |  DataBridge Inc.</w:t>
-      </w:r>
-    </w:p>
-    <w:p>
-      <w:pPr>
-        <w:spacing w:after="60"/>
-      </w:pPr>
-      <w:r>
-        <w:rPr>
-          <w:sz w:val="22"/>
-          <w:szCs w:val="22"/>
-        </w:rPr>
-        <w:t xml:space="preserve">June 2023 – August 2023  |  Remote</w:t>
-      </w:r>
-    </w:p>
-    <w:p>
-      <w:pPr>
-        <w:spacing w:after="80"/>
-      </w:pPr>
-    </w:p>
-    <w:p>
-      <w:pPr>
-        <w:spacing w:after="60"/>
-      </w:pPr>
-      <w:r>
-        <w:rPr>
-          <w:sz w:val="22"/>
-          <w:szCs w:val="22"/>
-        </w:rPr>
-        <w:t xml:space="preserve">*   Developed and enhanced responsive React dashboard components, incorporating real-time chart updates via WebSockets to create polished, accessible user interfaces.</w:t>
-      </w:r>
-    </w:p>
-    <w:p>
-      <w:pPr>
-        <w:spacing w:after="60"/>
-      </w:pPr>
-      <w:r>
-        <w:rPr>
-          <w:sz w:val="22"/>
-          <w:szCs w:val="22"/>
-        </w:rPr>
-        <w:t xml:space="preserve">*   Built a FastAPI microservice to ingest customer data, enabling richer data display capabilities for the frontend dashboard and reducing manual processing time by 60%.</w:t>
-      </w:r>
-    </w:p>
-    <w:p>
-      <w:pPr>
-        <w:spacing w:after="60"/>
-      </w:pPr>
-      <w:r>
-        <w:rPr>
-          <w:sz w:val="22"/>
-          <w:szCs w:val="22"/>
-        </w:rPr>
-        <w:t xml:space="preserve">*   Wrote comprehensive unit and integration tests using Jest and pytest, ensuring high code quality and achieving 85% code coverage for critical application features.</w:t>
-      </w:r>
-    </w:p>
-    <w:p>
-      <w:pPr>
-        <w:spacing w:after="60"/>
-      </w:pPr>
-      <w:r>
-        <w:rPr>
-          <w:sz w:val="22"/>
-          <w:szCs w:val="22"/>
-        </w:rPr>
-        <w:t xml:space="preserve">*   Collaborated effectively in bi-weekly sprints and daily standups within a cross-functional team of 8, fostering close collaboration with UX designers and backend engineers.</w:t>
+        <w:t xml:space="preserve">WORK EXPERIENCE</w:t>
+      </w:r>
+    </w:p>
+    <w:p>
+      <w:pPr>
+        <w:spacing w:after="80"/>
+      </w:pPr>
+    </w:p>
+    <w:p>
+      <w:pPr>
+        <w:spacing w:after="60"/>
+      </w:pPr>
+      <w:r>
+        <w:rPr>
+          <w:sz w:val="22"/>
+          <w:szCs w:val="22"/>
+        </w:rPr>
+        <w:t xml:space="preserve">Software Engineering Intern | DataBridge Inc.</w:t>
+      </w:r>
+    </w:p>
+    <w:p>
+      <w:pPr>
+        <w:spacing w:after="60"/>
+      </w:pPr>
+      <w:r>
+        <w:rPr>
+          <w:sz w:val="22"/>
+          <w:szCs w:val="22"/>
+        </w:rPr>
+        <w:t xml:space="preserve">June 2023 – August 2023 | Remote</w:t>
+      </w:r>
+    </w:p>
+    <w:p>
+      <w:pPr>
+        <w:spacing w:after="60"/>
+      </w:pPr>
+      <w:r>
+        <w:rPr>
+          <w:sz w:val="22"/>
+          <w:szCs w:val="22"/>
+        </w:rPr>
+        <w:t xml:space="preserve">*   Developed highly responsive and interactive React dashboard components, including real-time chart updates using WebSockets, enhancing user engagement and data visualization.</w:t>
+      </w:r>
+    </w:p>
+    <w:p>
+      <w:pPr>
+        <w:spacing w:after="60"/>
+      </w:pPr>
+      <w:r>
+        <w:rPr>
+          <w:sz w:val="22"/>
+          <w:szCs w:val="22"/>
+        </w:rPr>
+        <w:t xml:space="preserve">*   Translated design specifications into polished, accessible user interfaces, ensuring cross-browser compatibility and an intuitive user experience.</w:t>
+      </w:r>
+    </w:p>
+    <w:p>
+      <w:pPr>
+        <w:spacing w:after="60"/>
+      </w:pPr>
+      <w:r>
+        <w:rPr>
+          <w:sz w:val="22"/>
+          <w:szCs w:val="22"/>
+        </w:rPr>
+        <w:t xml:space="preserve">*   Collaborated closely with UX designers and backend engineers in bi-weekly sprints, actively participating in daily standups and leveraging Jira for efficient task management.</w:t>
+      </w:r>
+    </w:p>
+    <w:p>
+      <w:pPr>
+        <w:spacing w:after="60"/>
+      </w:pPr>
+      <w:r>
+        <w:rPr>
+          <w:sz w:val="22"/>
+          <w:szCs w:val="22"/>
+        </w:rPr>
+        <w:t xml:space="preserve">*   Contributed to full-stack development by building a FastAPI microservice for data ingestion, and ensured robust code quality with unit and integration tests (Jest).</w:t>
+      </w:r>
+    </w:p>
+    <w:p>
+      <w:pPr>
+        <w:spacing w:after="80"/>
+      </w:pPr>
+    </w:p>
+    <w:p>
+      <w:pPr>
+        <w:spacing w:after="60"/>
+      </w:pPr>
+      <w:r>
+        <w:rPr>
+          <w:sz w:val="22"/>
+          <w:szCs w:val="22"/>
+        </w:rPr>
+        <w:t xml:space="preserve">Undergraduate Research Assistant | UC Berkeley NLP Lab</w:t>
+      </w:r>
+    </w:p>
+    <w:p>
+      <w:pPr>
+        <w:spacing w:after="60"/>
+      </w:pPr>
+      <w:r>
+        <w:rPr>
+          <w:sz w:val="22"/>
+          <w:szCs w:val="22"/>
+        </w:rPr>
+        <w:t xml:space="preserve">January 2023 – May 2023 | Berkeley, CA</w:t>
+      </w:r>
+    </w:p>
+    <w:p>
+      <w:pPr>
+        <w:spacing w:after="60"/>
+      </w:pPr>
+      <w:r>
+        <w:rPr>
+          <w:sz w:val="22"/>
+          <w:szCs w:val="22"/>
+        </w:rPr>
+        <w:t xml:space="preserve">*   Automated data preprocessing pipelines using pandas and spaCy, significantly improving efficiency and reducing preparation time from 6 hours to under 30 minutes.</w:t>
+      </w:r>
+    </w:p>
+    <w:p>
+      <w:pPr>
+        <w:spacing w:after="60"/>
+      </w:pPr>
+      <w:r>
+        <w:rPr>
+          <w:sz w:val="22"/>
+          <w:szCs w:val="22"/>
+        </w:rPr>
+        <w:t xml:space="preserve">*   Applied analytical problem-solving to complex data challenges, contributing to research findings and presenting outcomes to a group of 15 researchers.</w:t>
       </w:r>
     </w:p>
     <w:p>
@@ -258,77 +318,67 @@
     </w:p>
     <w:p>
       <w:pPr>
-        <w:spacing w:after="80"/>
-      </w:pPr>
-    </w:p>
-    <w:p>
-      <w:pPr>
-        <w:spacing w:after="60"/>
-      </w:pPr>
-      <w:r>
-        <w:rPr>
-          <w:sz w:val="22"/>
-          <w:szCs w:val="22"/>
-        </w:rPr>
-        <w:t xml:space="preserve">*   Developed a full-stack job application tracker using React, Node.js/Express, and PostgreSQL, demonstrating end-to-end web application development.</w:t>
-      </w:r>
-    </w:p>
-    <w:p>
-      <w:pPr>
-        <w:spacing w:after="60"/>
-      </w:pPr>
-      <w:r>
-        <w:rPr>
-          <w:sz w:val="22"/>
-          <w:szCs w:val="22"/>
-        </w:rPr>
-        <w:t xml:space="preserve">*   Implemented secure JWT-based authentication and role-based access control, focusing on robust user experience and data security.</w:t>
-      </w:r>
-    </w:p>
-    <w:p>
-      <w:pPr>
-        <w:spacing w:after="60"/>
-      </w:pPr>
-      <w:r>
-        <w:rPr>
-          <w:sz w:val="22"/>
-          <w:szCs w:val="22"/>
-        </w:rPr>
-        <w:t xml:space="preserve">*   Deployed on AWS EC2 with Nginx reverse proxy and automated deployments via GitHub Actions, showcasing practical DevOps and deployment skills.</w:t>
-      </w:r>
-    </w:p>
-    <w:p>
-      <w:pPr>
-        <w:spacing w:after="80"/>
-      </w:pPr>
-    </w:p>
-    <w:p>
-      <w:pPr>
-        <w:spacing w:after="60"/>
-      </w:pPr>
-      <w:r>
-        <w:rPr>
-          <w:sz w:val="22"/>
-          <w:szCs w:val="22"/>
-        </w:rPr>
-        <w:t xml:space="preserve">SentimentLens — API &amp; Containerization  github.com/alexmorgan/sentimentlens</w:t>
-      </w:r>
-    </w:p>
-    <w:p>
-      <w:pPr>
-        <w:spacing w:after="80"/>
-      </w:pPr>
-    </w:p>
-    <w:p>
-      <w:pPr>
-        <w:spacing w:after="60"/>
-      </w:pPr>
-      <w:r>
-        <w:rPr>
-          <w:sz w:val="22"/>
-          <w:szCs w:val="22"/>
-        </w:rPr>
-        <w:t xml:space="preserve">*   Designed and implemented a RESTful API endpoint using FastAPI and Docker for a sentiment analysis model, demonstrating backend service development and containerization.</w:t>
+        <w:spacing w:after="60"/>
+      </w:pPr>
+      <w:r>
+        <w:rPr>
+          <w:sz w:val="22"/>
+          <w:szCs w:val="22"/>
+        </w:rPr>
+        <w:t xml:space="preserve">*   Engineered a full-stack job application tracker, leveraging React for a dynamic and responsive frontend.</w:t>
+      </w:r>
+    </w:p>
+    <w:p>
+      <w:pPr>
+        <w:spacing w:after="60"/>
+      </w:pPr>
+      <w:r>
+        <w:rPr>
+          <w:sz w:val="22"/>
+          <w:szCs w:val="22"/>
+        </w:rPr>
+        <w:t xml:space="preserve">*   Implemented robust JWT-based authentication and role-based access control, ensuring secure user experiences.</w:t>
+      </w:r>
+    </w:p>
+    <w:p>
+      <w:pPr>
+        <w:spacing w:after="60"/>
+      </w:pPr>
+      <w:r>
+        <w:rPr>
+          <w:sz w:val="22"/>
+          <w:szCs w:val="22"/>
+        </w:rPr>
+        <w:t xml:space="preserve">*   Managed deployment on AWS EC2 with Nginx reverse proxy and automated continuous integration/delivery via GitHub Actions.</w:t>
+      </w:r>
+    </w:p>
+    <w:p>
+      <w:pPr>
+        <w:spacing w:after="80"/>
+      </w:pPr>
+    </w:p>
+    <w:p>
+      <w:pPr>
+        <w:spacing w:after="60"/>
+      </w:pPr>
+      <w:r>
+        <w:rPr>
+          <w:sz w:val="22"/>
+          <w:szCs w:val="22"/>
+        </w:rPr>
+        <w:t xml:space="preserve">SentimentLens — ML Pipeline  github.com/alexmorgan/sentimentlens</w:t>
+      </w:r>
+    </w:p>
+    <w:p>
+      <w:pPr>
+        <w:spacing w:after="60"/>
+      </w:pPr>
+      <w:r>
+        <w:rPr>
+          <w:sz w:val="22"/>
+          <w:szCs w:val="22"/>
+        </w:rPr>
+        <w:t xml:space="preserve">*   Developed a scalable sentiment analysis service, exposing inference via a containerized FastAPI endpoint (Docker).</w:t>
       </w:r>
     </w:p>
     <w:p>
@@ -362,19 +412,19 @@
           <w:sz w:val="22"/>
           <w:szCs w:val="22"/>
         </w:rPr>
-        <w:t xml:space="preserve">University of California, Berkeley  —  B.S. Computer Science</w:t>
-      </w:r>
-    </w:p>
-    <w:p>
-      <w:pPr>
-        <w:spacing w:after="60"/>
-      </w:pPr>
-      <w:r>
-        <w:rPr>
-          <w:sz w:val="22"/>
-          <w:szCs w:val="22"/>
-        </w:rPr>
-        <w:t xml:space="preserve">Graduated May 2024  |  GPA: 3.7 / 4.0  |  Dean's List (4 semesters)</w:t>
+        <w:t xml:space="preserve">University of California, Berkeley — B.S. Computer Science</w:t>
+      </w:r>
+    </w:p>
+    <w:p>
+      <w:pPr>
+        <w:spacing w:after="60"/>
+      </w:pPr>
+      <w:r>
+        <w:rPr>
+          <w:sz w:val="22"/>
+          <w:szCs w:val="22"/>
+        </w:rPr>
+        <w:t xml:space="preserve">Graduated May 2024 | GPA: 3.7 / 4.0 | Dean's List (4 semesters)</w:t>
       </w:r>
     </w:p>
     <w:p>
@@ -433,18 +483,6 @@
           <w:szCs w:val="22"/>
         </w:rPr>
         <w:t xml:space="preserve">AWS Certified Cloud Practitioner (2023)</w:t>
-      </w:r>
-    </w:p>
-    <w:p>
-      <w:pPr>
-        <w:spacing w:after="60"/>
-      </w:pPr>
-      <w:r>
-        <w:rPr>
-          <w:sz w:val="22"/>
-          <w:szCs w:val="22"/>
-        </w:rPr>
-        <w:t xml:space="preserve">HackerRank Problem Solving — Gold Badge</w:t>
       </w:r>
     </w:p>
     <w:p>

</xml_diff>